<commit_message>
paper update 2026-10-14 13:48
</commit_message>
<xml_diff>
--- a/artifacts/submission/JNSM_manuscript.docx
+++ b/artifacts/submission/JNSM_manuscript.docx
@@ -92,7 +92,7 @@
           <w:spacing w:val="0"/>
           <w:color w:val="0E0E0E"/>
         </w:rPr>
-        <w:t xml:space="preserve">Small VPS providers pack many cheap, mostly-idle, occasionally-bursty tenants onto few physical cores; oversubscription is their business model. We recast safe oversubscription as three ordered problems whose bottleneck is observational capability. First, quota censoring hides demand: the point estimate equals the running-stretch mean, exact only when running and throttled stretch means agree; a conditional floor holds under continuous saturation; and from aggregate counters alone no estimator can be correct for all workloads, since two processes can produce identical observations with different demand. Across 180 cycles, throttle-corrected estimates track the truth while naive quota-release decisions violate the SLO in all 30 independent rounds. Second, capacity is set by phase structure, not average utilization: at the same 20% duty, random-phase and aligned fleets differ 3.5x in safe capacity (28 versus 8 seats at customer P5 &gt;= 70%), and a 35%-busy set collapsing while a 98%-busy set stays safe shows that safety cannot be read off utilization. Third, the sampling rate must resolve the bursts it prices. Together these capabilities form an observation set that a risk-calibrated admission controller implements: in a complete 14-round showdown it is the only policy combining competitive random-phase capacity with a conservative aligned-phase stop, while baseline policies oversell (customer P5 collapsing to 16%) or waste 2-3x capacity. All claims rest on mass repeats, two testbeds, read-only telemetry from production hosts we operate, and released artifacts.</w:t>
+        <w:t xml:space="preserve">Small VPS providers pack many cheap, mostly-idle, occasionally-bursty tenants onto few physical cores; oversubscription is their business model. We recast safe oversubscription as three ordered problems whose bottleneck is observational capability. First, quota censoring hides demand: the point estimate equals the running-stretch mean, exact only when running and throttled stretch means agree; a conditional floor holds under continuous saturation; and from aggregate counters alone no estimator can be correct for all workloads, since two processes can produce identical observations with different demand. Across 180 cycles, throttle-corrected estimates track the truth while naive quota-release decisions violate the SLO in all 30 independent rounds. Second, capacity is set by phase structure, not average utilization: at the same 20% duty, random-phase and aligned fleets differ 3.5x in safe capacity (28 versus 8 seats at customer P5 &gt;= 70%), and a 35%-busy set collapsing while a 98%-busy set stays safe shows that safety cannot be read off utilization. Third, the sampling rate must resolve the bursts it prices. Together these capabilities form an observation set that a risk-calibrated admission controller implements: in the 14 evaluated scenarios it admitted 16-20 tenants under randomized phases and stopped at eight under aligned phases while meeting the customer-quality bar, whereas baseline policies either oversold (customer P5 collapsing to 16%) or wasted 2-3x capacity. All claims rest on mass repeats, two testbeds, read-only telemetry from production hosts we operate, and released artifacts.</w:t>
       </w:r>
     </w:p>
     <w:p>
@@ -270,7 +270,7 @@
           <w:spacing w:val="0"/>
           <w:color w:val="0E0E0E"/>
         </w:rPr>
-        <w:t xml:space="preserve"> (exact non-identifiability — identical observations, different demand; stronger than statistical unbiasedness; construction in Section 3.3.1); what can be certified is a point estimate of the running-stretch mean plus a shape-free floor $q(1+t)$. The honest posture is to write down the identifiability boundary rather than pretend exact recovery.</w:t>
+        <w:t xml:space="preserve"> (exact non-identifiability — identical observations, different demand; stronger than statistical unbiasedness; construction in Section 3.3.1); what can be certified is a point estimate of the running-stretch mean plus a shape-free floor $q(1+t)$. The identifiability boundary is therefore stated explicitly rather than assumed away.</w:t>
       </w:r>
     </w:p>
     <w:p>
@@ -387,28 +387,7 @@
           <w:spacing w:val="0"/>
           <w:color w:val="262626"/>
         </w:rPr>
-        <w:t xml:space="preserve">Organizing thesis: the three problems tighten into </w:t>
-      </w:r>
-      <w:r>
-        <w:rPr>
-          <w:rFonts w:ascii="Times New Roman" w:hAnsi="Times New Roman" w:cs="Times New Roman"/>
-          <w:sz w:val="28"/>
-          <w:sz-cs w:val="28"/>
-          <w:b/>
-          <w:spacing w:val="0"/>
-          <w:color w:val="262626"/>
-        </w:rPr>
-        <w:t xml:space="preserve">observation necessity</w:t>
-      </w:r>
-      <w:r>
-        <w:rPr>
-          <w:rFonts w:ascii="Times New Roman" w:hAnsi="Times New Roman" w:cs="Times New Roman"/>
-          <w:sz w:val="28"/>
-          <w:sz-cs w:val="28"/>
-          <w:spacing w:val="0"/>
-          <w:color w:val="262626"/>
-        </w:rPr>
-        <w:t xml:space="preserve"> — three capabilities (censoring identification / phase resolution / time resolution) are each necessary (Section 3.6) and jointly sufficient for our target workload family (an empirical statement); the Section 7 showdown attributes each baseline's failure to exactly the capability it lacks.</w:t>
+        <w:t xml:space="preserve">Observation design: the three problems share one bottleneck — observational capability. Three capabilities (censoring identification / phase resolution / time resolution) are each necessary (Section 3.6) and jointly sufficient for our target workload family (an empirical statement); the Section 7 comparison attributes each baseline's failure to the capability it lacks.</w:t>
       </w:r>
     </w:p>
     <w:p>
@@ -602,7 +581,7 @@
           <w:spacing w:val="0"/>
           <w:color w:val="0E0E0E"/>
         </w:rPr>
-        <w:t xml:space="preserve"> — risk-calibrated admission (pseudocode and calibration protocol in Section 5.3.1) landing on the capacity oracle in an online head-to-head showdown; no-regression controls (KSM/FPR/zram, adaptive IO; micro-period quotas re-measured — the earlier +35% claim is withdrawn, Section 9.1) raising density per resource.</w:t>
+        <w:t xml:space="preserve"> — risk-calibrated admission (pseudocode and calibration protocol in Section 5.3.1) landing on the capacity oracle in an online head-to-head comparison; no-regression controls (KSM/FPR/zram, adaptive IO; micro-period quotas re-measured — the earlier +35% claim is withdrawn, Section 9.1) raising density per resource.</w:t>
       </w:r>
     </w:p>
     <w:p>
@@ -618,7 +597,7 @@
           <w:spacing w:val="0"/>
           <w:color w:val="0E0E0E"/>
         </w:rPr>
-        <w:t xml:space="preserve">1.4 Headline Findings</w:t>
+        <w:t xml:space="preserve">1.4 Summary of Results</w:t>
       </w:r>
     </w:p>
     <w:p>
@@ -862,7 +841,7 @@
           <w:spacing w:val="0"/>
           <w:color w:val="0E0E0E"/>
         </w:rPr>
-        <w:t xml:space="preserve">: 100-round knee (v2/v3), 180-cycle censoring (two batches), 30-round triple storm (4+26), 4-round fine scan, 3-round sync; explicit statistics (round-clustered, binomial bounds, P99 primary), anomalies (OOM-offline VMs, degraded rounds, batch drift) archived and merged via the v3 rework.</w:t>
+        <w:t xml:space="preserve">: 100-round knee (two batches), 180-cycle censoring (two batches), 30-round combined-stress campaign, 4-round fine scan, 3-round sync; explicit statistics (round-clustered, binomial bounds, P99 primary), anomalies (OOM-offline VMs, degraded rounds, batch drift) archived and merged via the v3 rework.</w:t>
       </w:r>
     </w:p>
     <w:p>
@@ -895,7 +874,7 @@
           <w:spacing w:val="0"/>
           <w:color w:val="0E0E0E"/>
         </w:rPr>
-        <w:t xml:space="preserve">Primary contributions (the paper's spine: Identify + Actuate)</w:t>
+        <w:t xml:space="preserve">Primary contributions (Identify and Actuate)</w:t>
       </w:r>
       <w:r>
         <w:rPr>
@@ -985,7 +964,7 @@
           <w:spacing w:val="0"/>
           <w:color w:val="0E0E0E"/>
         </w:rPr>
-        <w:t xml:space="preserve">: the complete risk-calibrated admission specification (pseudocode, parameters, calibration protocol), the complete 14-round showdown (both-bar final), the C5 anti-phase intervention (same tenants; phase arrangement alone changes capacity x2/x4), and fine-scan boundary pinning (sync [8,10), rand [28,32)).</w:t>
+        <w:t xml:space="preserve">: the complete risk-calibrated admission specification (pseudocode, parameters, calibration protocol), the complete 14-round comparison (both-bar final), the C5 anti-phase intervention (same tenants; phase arrangement alone changes capacity x2/x4), and fine-scan boundary pinning (sync [8,10), rand [28,32)).</w:t>
       </w:r>
     </w:p>
     <w:p>
@@ -1002,7 +981,7 @@
           <w:spacing w:val="0"/>
           <w:color w:val="0E0E0E"/>
         </w:rPr>
-        <w:t xml:space="preserve">Supporting contributions (serve the spine; not standalone claims)</w:t>
+        <w:t xml:space="preserve">Supporting contributions (supporting evidence; not standalone claims)</w:t>
       </w:r>
       <w:r>
         <w:rPr>
@@ -1052,7 +1031,7 @@
           <w:spacing w:val="0"/>
           <w:color w:val="0E0E0E"/>
         </w:rPr>
-        <w:t xml:space="preserve">: the assumption-explicit safe-capacity approximation and the PPC (parametric / empirical forward prediction / online actuator), with honestly reported prediction quality (4/5 zero over-admission; the optimistic sync case is vetoed by the online peak gate) — prediction is step advice and risk ranking; the online gate carries safety.</w:t>
+        <w:t xml:space="preserve">: the assumption-explicit safe-capacity approximation and the PPC (parametric / empirical forward prediction / online actuator), with prediction quality reported as measured (4/5 zero over-admission; the optimistic sync case is vetoed by the online peak gate) — prediction is step advice and risk ranking; the online gate carries safety.</w:t>
       </w:r>
     </w:p>
     <w:p>
@@ -1151,7 +1130,7 @@
           <w:spacing w:val="0"/>
           <w:color w:val="0E0E0E"/>
         </w:rPr>
-        <w:t xml:space="preserve">Section 2 related work; Section 3 system model and problem definition (incl. 3.3.1 identifiability); Section 4 measurement study; Section 5 design (risk-calibrated admission and the no-regression control stack, with algorithm pseudocode); Section 6 implementation and testbed; Section 7 evaluation (showdown, triple storm, estimator characterization); Section 8 physical-host validation and the density law; Section 9 resource-efficiency modules (KSM/FPR/zram/adaptive IO, incl. the micro-period self-audit correction); Section 10 discussion and limitations; Section 11 conclusion.</w:t>
+        <w:t xml:space="preserve">Section 2 related work; Section 3 system model and problem definition (incl. 3.3.1 identifiability); Section 4 measurement study; Section 5 design (risk-calibrated admission and the no-regression control stack, with algorithm pseudocode); Section 6 implementation and testbed; Section 7 evaluation (comparison, combined-stress, estimator characterization); Section 8 physical-host validation and the density law; Section 9 resource-efficiency modules (KSM/FPR/zram/adaptive IO, incl. the micro-period self-audit correction); Section 10 discussion and limitations; Section 11 conclusion.</w:t>
       </w:r>
     </w:p>
     <w:p>
@@ -1853,7 +1832,7 @@
           <w:spacing w:val="0"/>
           <w:color w:val="0E0E0E"/>
         </w:rPr>
-        <w:t xml:space="preserve"> for small providers: it decomposes "multi-resource oversubscription with multiple control levers" into separately comparable experimental units, quantifies which folk practices hold and which do not under short history, censored demand, and mixed bursty loads, and delivers a triple-storm-validated admission and shaping configuration. The relationship to hyperscale work is complementary: our hosts are smaller, observability is worse, and the decision population is cheaper — exactly the operating conditions of a large share of the global low-cost VPS market.</w:t>
+        <w:t xml:space="preserve"> for small providers: it decomposes "multi-resource oversubscription with multiple control levers" into separately comparable experimental units, quantifies which folk practices hold and which do not under short history, censored demand, and mixed bursty loads, and delivers a combined-stress-validated admission and shaping configuration. The relationship to hyperscale work is complementary: our hosts are smaller, observability is worse, and the decision population is cheaper — exactly the operating conditions of a large share of the global low-cost VPS market.</w:t>
       </w:r>
     </w:p>
     <w:p>
@@ -2798,7 +2777,7 @@
           <w:spacing w:val="0"/>
           <w:color w:val="0E0E0E"/>
         </w:rPr>
-        <w:t xml:space="preserve"> (counterexample now in unit tests: true demand 0.3, quota 0.2 → estimate 1.0), and may under-estimate intermittent saturation. It is therefore an </w:t>
+        <w:t xml:space="preserve"> (counterexample in the unit tests: true demand 0.3, quota 0.2 → estimate 1.0), and may under-estimate intermittent saturation. It is therefore an </w:t>
       </w:r>
       <w:r>
         <w:rPr>
@@ -2889,7 +2868,7 @@
           <w:spacing w:val="0"/>
           <w:color w:val="0E0E0E"/>
         </w:rPr>
-        <w:t xml:space="preserve"> Window $W$ spanning several quota periods $P$; quota $q$ (cores); budget $qP$ per period. Let $u$ = mean usage, $t$ = throttled-time fraction, $\bar d$ = window-mean demand, $\overline{d}_{\text{run}}/\overline{d}_{\text{thr}}$ = mean demand inside the running / throttled stretches. Assumptions: (A1) single cgroup, work-conserving, no external steal; (A2) the budget is exhausted within the window (else no throttle evidence); (A3) $W \gg P$, ignoring period-boundary effects for now. </w:t>
+        <w:t xml:space="preserve"> Window $W$ spanning several quota periods $P$; quota $q$ (cores); budget $qP$ per period. Let $u$ = mean usage, $t$ = throttled-time fraction, $\bar d$ = window-mean demand, $\overline{d}_{\text{run}}/\overline{d}_{\text{thr}}$ = mean demand inside the running / throttled stretches. Assumptions: (A1) single cgroup, work-conserving, no external steal; (A2) the budget is exhausted within the window (else no throttle evidence); (A3) $W \gg P$, ignoring period-boundary effects. </w:t>
       </w:r>
       <w:r>
         <w:rPr>
@@ -3259,7 +3238,7 @@
           <w:spacing w:val="0"/>
           <w:color w:val="0E0E0E"/>
         </w:rPr>
-        <w:t xml:space="preserve">Added boundary (reviewer counterexample, 2026-10-13):</w:t>
+        <w:t xml:space="preserve">Boundary (counterexample):</w:t>
       </w:r>
       <w:r>
         <w:rPr>
@@ -6012,7 +5991,7 @@
           <w:spacing w:val="0"/>
           <w:color w:val="0E0E0E"/>
         </w:rPr>
-        <w:t xml:space="preserve">v3 rework (all five neighbors online throughout, 50 rounds; Figure 29).</w:t>
+        <w:t xml:space="preserve">Rework batch (all five neighbors online throughout, 50 rounds; Figure 29).</w:t>
       </w:r>
       <w:r>
         <w:rPr>
@@ -6622,7 +6601,7 @@
           <w:spacing w:val="0"/>
           <w:color w:val="0E0E0E"/>
         </w:rPr>
-        <w:t xml:space="preserve">: 48/48 four-neighbor rounds sit at P99 ≥ 20.7 ms while 93/98 three-neighbor rounds stay ≤ 12 ms — the two distributions do not overlap (Figure 17 right). (ii) Absolute levels run slightly higher than the first 5-round batch (3n 4.9, 4n 23.8 ms → 7.4/24.4 ms here); the ordering and the cliff position are unchanged. We record the drift honestly; plausible causes include host state after ~40 days online and cache/fragmentation differences between batches. (iii) The verdict is threshold-insensitive: even at a 13.5 ms bar only 7% of three-neighbor rounds would be flagged, while the four-neighbor minimum is 20.7 ms. (iv) </w:t>
+        <w:t xml:space="preserve">: 48/48 four-neighbor rounds sit at P99 ≥ 20.7 ms while 93/98 three-neighbor rounds stay ≤ 12 ms — the two distributions do not overlap (Figure 17 right). (ii) Absolute levels run slightly higher than the first 5-round batch (3n 4.9, 4n 23.8 ms → 7.4/24.4 ms here); the ordering and the cliff position are unchanged. We record the drift; plausible causes include host state after ~40 days online and cache/fragmentation differences between batches. (iii) The verdict is threshold-insensitive: even at a 13.5 ms bar only 7% of three-neighbor rounds would be flagged, while the four-neighbor minimum is 20.7 ms. (iv) </w:t>
       </w:r>
       <w:r>
         <w:rPr>
@@ -6685,7 +6664,7 @@
           <w:spacing w:val="0"/>
           <w:color w:val="0E0E0E"/>
         </w:rPr>
-        <w:t xml:space="preserve"> (same protocol, same 87% busy; absolute drift recorded honestly) — the conservative statement uses the eps=0 capacity of 2.</w:t>
+        <w:t xml:space="preserve"> (same protocol, same 87% busy; absolute drift recorded) — the conservative statement uses the eps=0 capacity of 2.</w:t>
       </w:r>
     </w:p>
     <w:p>
@@ -8246,7 +8225,7 @@
           <w:spacing w:val="0"/>
           <w:color w:val="0E0E0E"/>
         </w:rPr>
-        <w:t xml:space="preserve">Pinning services and probe to cores 0–1 and tenants to cores 2–3 yields zero violations at 1–5 pegged neighbors (P99 2.9–3.2 ms); tenants share the remaining two cores as expected (about 44% of full speed each at five tenants). The triple-storm synthesis (Section 4.5 / 6.5) reproduces this four times. The cost is explicitly relocated to the "economy tier" — protected services no longer compete.</w:t>
+        <w:t xml:space="preserve">Pinning services and probe to cores 0–1 and tenants to cores 2–3 yields zero violations at 1–5 pegged neighbors (P99 2.9–3.2 ms); tenants share the remaining two cores as expected (about 44% of full speed each at five tenants). The combined-stress synthesis (Section 4.5 / 6.5) reproduces this four times. The cost is explicitly relocated to the "economy tier" — protected services no longer compete.</w:t>
       </w:r>
     </w:p>
     <w:p>
@@ -9309,7 +9288,7 @@
           <w:spacing w:val="0"/>
           <w:color w:val="0E0E0E"/>
         </w:rPr>
-        <w:t xml:space="preserve">; the protection envelope is: the SLO commitment on $c_{\text{svc}}$ dedicated cores for services + each tenant's $\text{high}$ bytes of honest memory + each tenant's IO cap. The difference between the two envelopes </w:t>
+        <w:t xml:space="preserve">; the protection envelope is: the SLO commitment on $c_{\text{svc}}$ dedicated cores for services + each tenant's $\text{high}$ bytes of hot memory + each tenant's IO cap. The difference between the two envelopes </w:t>
       </w:r>
       <w:r>
         <w:rPr>
@@ -11317,7 +11296,7 @@
           <w:spacing w:val="0"/>
           <w:color w:val="262626"/>
         </w:rPr>
-        <w:t xml:space="preserve">Three evaluation groups: (A) admission-policy comparison; (B) shaping and protection-envelope comparison; (C) triple-storm synthesis validation, followed by the production-telemetry usage and an explicit gap list. Common SLO: service P99 ≤ 10 ms.</w:t>
+        <w:t xml:space="preserve">Three evaluation groups: (A) admission-policy comparison; (B) shaping and protection-envelope comparison; (C) combined-stress synthesis validation, followed by the production-telemetry usage and an explicit gap list. Common SLO: service P99 ≤ 10 ms.</w:t>
       </w:r>
     </w:p>
     <w:p>
@@ -11349,7 +11328,7 @@
           <w:spacing w:val="0"/>
           <w:color w:val="0E0E0E"/>
         </w:rPr>
-        <w:t xml:space="preserve">Testbed and metrics: Sections 3–4 and 7. Admission comparisons use a closed loop: five candidate tenants arrive one at a time, a policy decides allow/defer from evidence visible at that moment, and allowed candidates are actually started and measured. Shaping comparisons use the neighbor sweep (0–5 tenants) plus the full triple storm. Every key conclusion replicates at least twice (knee: 5 rounds; censoring: 7 cycles; synthesis: 4 passes).</w:t>
+        <w:t xml:space="preserve">Testbed and metrics: Sections 3–4 and 7. Admission comparisons use a closed loop: five candidate tenants arrive one at a time, a policy decides allow/defer from evidence visible at that moment, and allowed candidates are actually started and measured. Shaping comparisons use the neighbor sweep (0–5 tenants) plus the full combined-stress. Every key conclusion replicates at least twice (knee: 5 rounds; censoring: 7 cycles; synthesis: 4 passes).</w:t>
       </w:r>
     </w:p>
     <w:p>
@@ -12954,7 +12933,7 @@
           <w:spacing w:val="0"/>
           <w:color w:val="0E0E0E"/>
         </w:rPr>
-        <w:t xml:space="preserve">: the same counters over-estimate bursty demand (counterexample now in unit tests: true 0.3, quota 0.2 → estimate 1.0) and may under-estimate intermittent saturation; the "conservative direction" holds only on the saturated family. We therefore position it as an </w:t>
+        <w:t xml:space="preserve">: the same counters over-estimate bursty demand (counterexample in the unit tests: true 0.3, quota 0.2 → estimate 1.0) and may under-estimate intermittent saturation; the "conservative direction" holds only on the saturated family. We therefore position it as an </w:t>
       </w:r>
       <w:r>
         <w:rPr>
@@ -13314,7 +13293,7 @@
           <w:spacing w:val="0"/>
           <w:color w:val="0E0E0E"/>
         </w:rPr>
-        <w:t xml:space="preserve">7.4b Online Admission Showdown (Figure 20)</w:t>
+        <w:t xml:space="preserve">7.4b Online Admission Comparison (Figure 20)</w:t>
       </w:r>
     </w:p>
     <w:p>
@@ -13354,7 +13333,7 @@
           <w:spacing w:val="0"/>
           <w:color w:val="262626"/>
         </w:rPr>
-        <w:t xml:space="preserve">Figure 20 Online admission showdown: policy stops vs measured capacity brackets (14 rounds)</w:t>
+        <w:t xml:space="preserve">Figure 20 Online admission comparison: policy stops vs measured capacity brackets (14 rounds)</w:t>
       </w:r>
     </w:p>
     <w:p>
@@ -14720,17 +14699,17 @@
           <w:spacing w:val="0"/>
           <w:color w:val="0E0E0E"/>
         </w:rPr>
-        <w:t xml:space="preserve">Sampling caveat (honest):</w:t>
-      </w:r>
-      <w:r>
-        <w:rPr>
-          <w:rFonts w:ascii="Times New Roman" w:hAnsi="Times New Roman" w:cs="Times New Roman"/>
-          <w:sz w:val="30"/>
-          <w:sz-cs w:val="30"/>
-          <w:spacing w:val="0"/>
-          <w:color w:val="0E0E0E"/>
-        </w:rPr>
-        <w:t xml:space="preserve"> v2 sync rounds have a probe-before-rates ordering defect that pushed rate sampling out of the burst window (audible/util80 happen to have valid violation evidence via phase drift; fixed etc. lack the p5 column); the corrected seven-round rerun (show5) was completed and the sync customer columns are reported via the four-round ladder.</w:t>
+        <w:t xml:space="preserve">Sampling caveat:</w:t>
+      </w:r>
+      <w:r>
+        <w:rPr>
+          <w:rFonts w:ascii="Times New Roman" w:hAnsi="Times New Roman" w:cs="Times New Roman"/>
+          <w:sz w:val="30"/>
+          <w:sz-cs w:val="30"/>
+          <w:spacing w:val="0"/>
+          <w:color w:val="0E0E0E"/>
+        </w:rPr>
+        <w:t xml:space="preserve"> the earlier sync rounds have a probe-before-rates ordering defect that pushed rate sampling out of the burst window (audible/util80 happen to have valid violation evidence via phase drift; fixed etc. lack the p5 column); the corrected seven-round rerun (show5) was completed and the sync customer columns are reported via the four-round ladder.</w:t>
       </w:r>
     </w:p>
     <w:p>
@@ -14786,7 +14765,7 @@
           <w:spacing w:val="0"/>
           <w:color w:val="262626"/>
         </w:rPr>
-        <w:t xml:space="preserve">Figure 10 Triple-storm synthesis (4 runs)</w:t>
+        <w:t xml:space="preserve">Figure 10 Combined-stress validation (4 runs)</w:t>
       </w:r>
     </w:p>
     <w:p>
@@ -15295,7 +15274,7 @@
           <w:spacing w:val="0"/>
           <w:color w:val="0E0E0E"/>
         </w:rPr>
-        <w:t xml:space="preserve">v3 rework repeat (Figure 19).</w:t>
+        <w:t xml:space="preserve">Rework repeat (Figure 19).</w:t>
       </w:r>
       <w:r>
         <w:rPr>
@@ -15421,7 +15400,7 @@
           <w:spacing w:val="0"/>
           <w:color w:val="0E0E0E"/>
         </w:rPr>
-        <w:t xml:space="preserve">Statistical honesty:</w:t>
+        <w:t xml:space="preserve">Statistical note:</w:t>
       </w:r>
       <w:r>
         <w:rPr>
@@ -15492,7 +15471,7 @@
           <w:spacing w:val="0"/>
           <w:color w:val="262626"/>
         </w:rPr>
-        <w:t xml:space="preserve">Figure 19 Triple-storm rework, 26 rounds: 25/26 pass, one degraded round at 25.3 ms</w:t>
+        <w:t xml:space="preserve">Figure 19 Combined-stress rework, 26 rounds: 25/26 pass, one degraded round at 25.3 ms</w:t>
       </w:r>
     </w:p>
     <w:p>
@@ -15741,7 +15720,7 @@
           <w:spacing w:val="0"/>
           <w:color w:val="0E0E0E"/>
         </w:rPr>
-        <w:t xml:space="preserve">Reading (three honest points).</w:t>
+        <w:t xml:space="preserve">Reading.</w:t>
       </w:r>
       <w:r>
         <w:rPr>
@@ -15792,7 +15771,7 @@
           <w:spacing w:val="0"/>
           <w:color w:val="0E0E0E"/>
         </w:rPr>
-        <w:t xml:space="preserve"> is too tight for a 3 GB guest (cf. the soft-threshold semantics of Section 4.4.4); the economy tier's experience ceiling is a product parameter, not a policy defect. (iii) Throttle-corrected estimation carries a phase bias: with bursty background, instant sampling at decision time underestimates demand (estimates oscillated between 0.01 and 1.90 cores), making the aware policy over-conservative (1 seat vs naive's 3) — the design-to-implementation gap versus the time-aligned aggregate upper quantile of Section 5.3, tracked as an improvement item. The v2 revision now implements the time-aligned aggregation and is re-measured as a four-policy comparison on the second testbed; results merge as supplementary material.</w:t>
+        <w:t xml:space="preserve"> is too tight for a 3 GB guest (cf. the soft-threshold semantics of Section 4.4.4); the economy tier's experience ceiling is a product parameter, not a policy defect. (iii) Throttle-corrected estimation carries a phase bias: with bursty background, instant sampling at decision time underestimates demand (estimates oscillated between 0.01 and 1.90 cores), making the aware policy over-conservative (1 seat vs naive's 3) — the design-to-implementation gap versus the time-aligned aggregate upper quantile of Section 5.3, tracked as an improvement item. The revision implements the time-aligned aggregation; it is re-measured as a four-policy comparison on the second testbed, with results merged as supplementary material.</w:t>
       </w:r>
     </w:p>
     <w:p>
@@ -16263,7 +16242,7 @@
           <w:spacing w:val="0"/>
           <w:color w:val="0E0E0E"/>
         </w:rPr>
-        <w:t xml:space="preserve"> (host busy 30.1%, peak 47.2%); the light stream has now accumulated </w:t>
+        <w:t xml:space="preserve"> (host busy 30.1%, peak 47.2%); the light stream has accumulated </w:t>
       </w:r>
       <w:r>
         <w:rPr>
@@ -16702,7 +16681,7 @@
           <w:spacing w:val="0"/>
           <w:color w:val="262626"/>
         </w:rPr>
-        <w:t xml:space="preserve">Incident (recorded honestly): during setup the host suffered one kernel panic (</w:t>
+        <w:t xml:space="preserve">Recorded incident: during setup the host suffered one kernel panic (</w:t>
       </w:r>
       <w:r>
         <w:rPr>
@@ -18992,17 +18971,17 @@
           <w:spacing w:val="0"/>
           <w:color w:val="0E0E0E"/>
         </w:rPr>
-        <w:t xml:space="preserve">Boundaries (honest).</w:t>
-      </w:r>
-      <w:r>
-        <w:rPr>
-          <w:rFonts w:ascii="Times New Roman" w:hAnsi="Times New Roman" w:cs="Times New Roman"/>
-          <w:sz w:val="30"/>
-          <w:sz-cs w:val="30"/>
-          <w:spacing w:val="0"/>
-          <w:color w:val="0E0E0E"/>
-        </w:rPr>
-        <w:t xml:space="preserve"> (i) Each configuration now pools three capmix rounds; per-level P5 still carries non-monotone sampling noise, e.g., $\varphi=0.25$ L24 &gt; L20 — larger round pools and a prediction-error distribution over more seeds are future work. (ii) The C5 anti-phase arrangement experiment (same tenants, two groups offset by 30 s, capacity x2) upgrades "phase is arrangeable" from observation to intervention. (iii) The positioning is a </w:t>
+        <w:t xml:space="preserve">Boundaries.</w:t>
+      </w:r>
+      <w:r>
+        <w:rPr>
+          <w:rFonts w:ascii="Times New Roman" w:hAnsi="Times New Roman" w:cs="Times New Roman"/>
+          <w:sz w:val="30"/>
+          <w:sz-cs w:val="30"/>
+          <w:spacing w:val="0"/>
+          <w:color w:val="0E0E0E"/>
+        </w:rPr>
+        <w:t xml:space="preserve"> (i) Each configuration pools three capmix rounds; per-level P5 still carries non-monotone sampling noise, e.g., $\varphi=0.25$ L24 &gt; L20 — larger round pools and a prediction-error distribution over more seeds are future work. (ii) The C5 anti-phase arrangement experiment (same tenants, two groups offset by 30 s, capacity x2) upgrades "phase is arrangeable" from observation to intervention. (iii) The positioning is a </w:t>
       </w:r>
       <w:r>
         <w:rPr>
@@ -19257,7 +19236,7 @@
           <w:spacing w:val="0"/>
           <w:color w:val="0E0E0E"/>
         </w:rPr>
-        <w:t xml:space="preserve"> inputs are one-minute production duties plus an in-period activity model and contain no sub-minute phase structure; this supports a minute-granularity replay model, not measured sub-minute structure. Real-trace measurements over the 64-VM x 30-min replay schedules: joint peak 14 cores (P50=P95=max=14) versus iid peaks 12-15. On this low-correlation drifting fleet the two differ little, and the iid risk grows with phase alignment (extremes in C5 and the synchronized sells). Block-length selection chose B=1 with KS~0.16; the spread across B in {1,2,5,10,15} is 0.16-0.21, weakly resolvable and reported honestly. The online replay (replay1) drove the 64-tenant schedule for 30 minutes on the 8-core pool: mean pool busy 42.0% (3.4 cores), peak saturation 100% (&gt;=8 cores concurrent), service P99 0.706-0.729 ms across five probes with one 1.599 ms tail. The predicted over-pool risk materializes at peak while the isolation envelope keeps the service flat. The multi-window recheck sliced the same telemetry into five non-overlapping 30-minute windows, each with an independent forward prediction: direction hit 5/5 (predicted P(peak&gt;8)=98-100% versus observed over-pool 3.5-8.3%), peak magnitudes of the same order (predicted P50 11-19 versus observed 12-16; per-window offsets +5/±1/-2/-1/0, variance reported honestly). </w:t>
+        <w:t xml:space="preserve"> inputs are one-minute production duties plus an in-period activity model and contain no sub-minute phase structure; this supports a minute-granularity replay model, not measured sub-minute structure. Real-trace measurements over the 64-VM x 30-min replay schedules: joint peak 14 cores (P50=P95=max=14) versus iid peaks 12-15. On this low-correlation drifting fleet the two differ little, and the iid risk grows with phase alignment (extremes in C5 and the synchronized sells). Block-length selection chose B=1 with KS~0.16; the spread across B in {1,2,5,10,15} is 0.16-0.21, weakly resolvable. The online replay (replay1) drove the 64-tenant schedule for 30 minutes on the 8-core pool: mean pool busy 42.0% (3.4 cores), peak saturation 100% (&gt;=8 cores concurrent), service P99 0.706-0.729 ms across five probes with one 1.599 ms tail. The predicted over-pool risk materializes at peak while the isolation envelope keeps the service flat. The multi-window recheck sliced the same telemetry into five non-overlapping 30-minute windows, each with an independent forward prediction: direction hit 5/5 (predicted P(peak&gt;8)=98-100% versus observed over-pool 3.5-8.3%), peak magnitudes of the same order (predicted P50 11-19 versus observed 12-16; per-window offsets +5/±1/-2/-1/0, variance reported). </w:t>
       </w:r>
       <w:r>
         <w:rPr>
@@ -19278,7 +19257,7 @@
           <w:spacing w:val="0"/>
           <w:color w:val="0E0E0E"/>
         </w:rPr>
-        <w:t xml:space="preserve"> the second-level series is reconstructed from minute-level duties plus a within-period phase model; this validates model-replay consistency, not independently measured second-level production truth. Both methods predict over-pool on this deliberately low-correlation fleet, so the discrimination evidence lives in the synthetic configurations (iid blind versus PPC separating five structures) and the online showdown (util80/audible collapsing in sync); independent second-level truth, false-positive/negative rates and multi-threshold behavior are future work. The third mode is the online actuator: a Taligned-style peak envelope (60 one-second phase buckets plus a class prior), a low-cost online approximation of PPC rather than a resampler; its showdown behavior (Section 7.4b) is the evidence for that approximation. All three share one principle — accounting on the joint phase structure — at different resolutions and for different purposes, and the paper labels them separately.</w:t>
+        <w:t xml:space="preserve"> the second-level series is reconstructed from minute-level duties plus a within-period phase model; this validates model-replay consistency, not independently measured second-level production truth. Both methods predict over-pool on this deliberately low-correlation fleet, so the discrimination evidence lives in the synthetic configurations (iid blind versus PPC separating five structures) and the online comparison (util80/audible collapsing in sync); independent second-level truth, false-positive/negative rates and multi-threshold behavior are future work. The third mode is the online actuator: a Taligned-style peak envelope (60 one-second phase buckets plus a class prior), a low-cost online approximation of PPC rather than a resampler; its comparison behavior (Section 7.4b) is the evidence for that approximation. All three share one principle — accounting on the joint phase structure — at different resolutions and for different purposes, and the paper labels them separately.</w:t>
       </w:r>
     </w:p>
     <w:p>
@@ -19389,7 +19368,7 @@
           <w:spacing w:val="0"/>
           <w:color w:val="0E0E0E"/>
         </w:rPr>
-        <w:t xml:space="preserve"> falling inside a bracket is not hitting the exact oracle — e.g. the sync prediction of 10 now sits exactly at the fine-scan first-fail step (boundary [8,10): 8 seats P5=98.8%, 10 seats P5=62.2%) — the online peak gate, not the offline prediction, is what stops at 8; rand 24 is conservative by 4 after the fine scan pinned the bracket at [28,32). The random-end tail optimism matches Section 8.5 and is corrected by the measured bar.</w:t>
+        <w:t xml:space="preserve"> falling inside a bracket is not hitting the exact oracle — e.g. the sync prediction of 10 sits exactly at the fine-scan first-fail step (boundary [8,10): 8 seats P5=98.8%, 10 seats P5=62.2%) — the online peak gate, not the offline prediction, is what stops at 8; rand 24 is conservative by 4 after the fine scan pinned the bracket at [28,32). The random-end tail optimism matches Section 8.5 and is corrected by the measured bar.</w:t>
       </w:r>
     </w:p>
     <w:p>
@@ -19569,7 +19548,7 @@
           <w:spacing w:val="0"/>
           <w:color w:val="0E0E0E"/>
         </w:rPr>
-        <w:t xml:space="preserve"> PPC needs phase history (cold start degrades to priors/observation windows); the random end still needs the measured bar; validation is offline forward prediction (train-only resampling scored on the held-out third) plus the online showdown (the </w:t>
+        <w:t xml:space="preserve"> PPC needs phase history (cold start degrades to priors/observation windows); the random end still needs the measured bar; validation is offline forward prediction (train-only resampling scored on the held-out third) plus the online comparison (the </w:t>
       </w:r>
       <w:r>
         <w:rPr>
@@ -20323,7 +20302,7 @@
           <w:spacing w:val="0"/>
           <w:color w:val="262626"/>
         </w:rPr>
-        <w:t xml:space="preserve"> — the paper's spine is the Identify/Predict/Actuate chain of Sections 3/5/7/8; this chapter verifies that the no-regression principle extends across resources and provides density-ceiling context.</w:t>
+        <w:t xml:space="preserve"> — the main line is the Identify/Predict/Actuate chain of Sections 3/5/7/8; this chapter verifies that the no-regression principle extends across resources and provides density-ceiling context.</w:t>
       </w:r>
     </w:p>
     <w:p>
@@ -20853,7 +20832,7 @@
           <w:spacing w:val="0"/>
           <w:color w:val="0E0E0E"/>
         </w:rPr>
-        <w:t xml:space="preserve">Lessons, now fixed in </w:t>
+        <w:t xml:space="preserve">Lessons, fixed in </w:t>
       </w:r>
       <w:r>
         <w:rPr>
@@ -21473,7 +21452,7 @@
           <w:spacing w:val="0"/>
           <w:color w:val="0E0E0E"/>
         </w:rPr>
-        <w:t xml:space="preserve"> — the tenant storm does not touch the service (isolation envelope); arm differences &lt;1% (adaptive shows no advantage under this load — reported honestly).</w:t>
+        <w:t xml:space="preserve"> — the tenant storm does not touch the service (isolation envelope); arm differences &lt;1% (adaptive shows no advantage under this load).</w:t>
       </w:r>
     </w:p>
     <w:p>
@@ -21547,7 +21526,7 @@
           <w:spacing w:val="0"/>
           <w:color w:val="0E0E0E"/>
         </w:rPr>
-        <w:t xml:space="preserve"> (service unaffected; the compression ratio is reported for compressible cold pages, honestly); </w:t>
+        <w:t xml:space="preserve"> (service unaffected; the compression ratio is reported for compressible cold pages); </w:t>
       </w:r>
       <w:r>
         <w:rPr>
@@ -22044,7 +22023,7 @@
           <w:spacing w:val="0"/>
           <w:color w:val="0E0E0E"/>
         </w:rPr>
-        <w:t xml:space="preserve"> Nested virtualization adds a scheduling layer; randomized orders and replicates suppress noise, and service-side metrics are stable across synthesis passes. The weight-failure mechanism is not yet localized (a host-side packet-path hypothesis is unverified) and is kept as an open question. The joint validation exposed a further issue: instant sampling of bursty background load carries a phase bias, the full controller (phase profiles + censoring correction + pause guardrail) is now implemented and evaluated in the online showdown (Section 7.4b; the j1 joint pilot is kept as a historical design–implementation gap record); the customer-side canary shows that a tight </w:t>
+        <w:t xml:space="preserve"> Nested virtualization adds a scheduling layer; randomized orders and replicates suppress noise, and service-side metrics are stable across synthesis passes. The weight-failure mechanism is not yet localized (a host-side packet-path hypothesis is unverified) and is kept as an open question. The joint validation exposed a further issue: instant sampling of bursty background load carries a phase bias, the full controller (phase profiles + censoring correction + pause guardrail) is implemented and evaluated in the online comparison (Section 7.4b; the j1 joint pilot is kept as a historical design–implementation gap record); the customer-side canary shows that a tight </w:t>
       </w:r>
       <w:r>
         <w:rPr>
@@ -22127,7 +22106,7 @@
           <w:spacing w:val="0"/>
           <w:color w:val="0E0E0E"/>
         </w:rPr>
-        <w:t xml:space="preserve"> Key conclusions carry mass repeats (knee 50, censoring 90 cycles in 30 rounds, triple storm 24); the admission showdown v2 (14 rounds), boundary fine scans (multi-cycle, 2 rounds per step) and mixed-phase repeats are running; zero-failure claims are reported with Clopper-Pearson bounds and explicit trial counts, never as long-term guarantees.</w:t>
+        <w:t xml:space="preserve"> Key conclusions carry mass repeats (knee 50, censoring 90 cycles in 30 rounds, combined-stress 24); the admission comparison v2 (14 rounds), boundary fine scans (multi-cycle, 2 rounds per step) and mixed-phase repeats are running; zero-failure claims are reported with Clopper-Pearson bounds and explicit trial counts, never as long-term guarantees.</w:t>
       </w:r>
     </w:p>
     <w:p>
@@ -22254,7 +22233,7 @@
           <w:spacing w:val="0"/>
           <w:color w:val="0E0E0E"/>
         </w:rPr>
-        <w:t xml:space="preserve"> (Section 3.6): censoring identification, phase resolution and time resolution are each necessary — with (1)(2) directly measured and (3) currently a construction plus indirect evidence — and jointly sufficient as an empirical statement for our target workload family (the policy with all three is the only one in the 14-round showdown combining random-phase capacity (16–20 seats) with the aligned-phase 8-seat stop and random-phase customer compliance; aligned-phase customer P5 ~99% at 8 seats, 4-round ladder).</w:t>
+        <w:t xml:space="preserve"> (Section 3.6): censoring identification, phase resolution and time resolution are each necessary — with (1)(2) directly measured and (3) currently a construction plus indirect evidence — and jointly sufficient as an empirical statement for our target workload family (the policy with all three is the only one in the 14-round comparison combining random-phase capacity (16–20 seats) with the aligned-phase 8-seat stop and random-phase customer compliance; aligned-phase customer P5 ~99% at 8 seats, 4-round ladder).</w:t>
       </w:r>
     </w:p>
     <w:p>
@@ -22308,7 +22287,7 @@
           <w:spacing w:val="0"/>
           <w:color w:val="0E0E0E"/>
         </w:rPr>
-        <w:t xml:space="preserve"> Capacity is set by phase structure, not average utilization: random vs aligned safe capacity 28 vs 8 (primary bar P5 ≥ 70%; 3.5x–4x across bars), with the utilization-impossibility counterexample — and the measured inversion (safe fleet reports 66.4-68.0% busy, the collapsing fleet 30.4%). The safe-capacity approximation N* = C/(phi + (1-phi) rho) is stated with explicit assumptions and honest error directions. The Phase-Profile Convolution (PPC) now has three artifact-backed modes (parametric simulation, strict three-way joint block bootstrap with a held-out test third, online peak-envelope approximation); iid convolution is provably blind to exactly the axis that decides safety (the marginal illusion), and the C5 intervention shows the axis is controllable (capacity x2/x4 by phase arrangement alone).</w:t>
+        <w:t xml:space="preserve"> Capacity is set by phase structure, not average utilization: random vs aligned safe capacity 28 vs 8 (primary bar P5 ≥ 70%; 3.5x–4x across bars), with the utilization-impossibility counterexample — and the measured inversion (safe fleet reports 66.4-68.0% busy, the collapsing fleet 30.4%). The safe-capacity approximation N* = C/(phi + (1-phi) rho) is stated with explicit assumptions and measured error directions. The Phase-Profile Convolution (PPC) has three artifact-backed modes (parametric simulation, strict three-way joint block bootstrap with a held-out test third, online peak-envelope approximation); iid convolution is provably blind to exactly the axis that decides safety (the marginal illusion), and the C5 intervention shows the axis is controllable (capacity x2/x4 by phase arrangement alone).</w:t>
       </w:r>
     </w:p>
     <w:p>
@@ -22335,7 +22314,7 @@
           <w:spacing w:val="0"/>
           <w:color w:val="0E0E0E"/>
         </w:rPr>
-        <w:t xml:space="preserve"> In the complete 14-round showdown (identical arrival streams and evidence), the phase-aware admission is the only policy combining the verified aligned-phase bracket (8 seats, customer P5 ~99%) with competitive random-phase capacity (16–20); the audible-style and busy-threshold baselines sell 40 in the aligned phase and collapse customer P5 to 16%, and the fixed-oversubscription baseline violates the primary bar at 16 — the phase-blindness of independence assumptions and of utilization criteria, quantified end to end. On the resource-efficiency side (supporting extension, Chapter 9), balloon-free reclaim (KSM 33.4% of fleet RAM; free-page reporting reclaiming 303 MB; zram absorbing 176.8 GB of overflow) raises density without shrinking tenant-visible resources under the </w:t>
+        <w:t xml:space="preserve"> In the complete 14-round comparison (identical arrival streams and evidence), the phase-aware admission is the only policy combining the verified aligned-phase bracket (8 seats, customer P5 ~99%) with competitive random-phase capacity (16–20); the audible-style and busy-threshold baselines sell 40 in the aligned phase and collapse customer P5 to 16%, and the fixed-oversubscription baseline violates the primary bar at 16 — the phase-blindness of independence assumptions and of utilization criteria, quantified end to end. On the resource-efficiency side (supporting extension, Chapter 9), balloon-free reclaim (KSM 33.4% of fleet RAM; free-page reporting reclaiming 303 MB; zram absorbing 176.8 GB of overflow) raises density without shrinking tenant-visible resources under the </w:t>
       </w:r>
       <w:r>
         <w:rPr>
@@ -22932,7 +22911,7 @@
           <w:spacing w:val="0"/>
           <w:color w:val="0E0E0E"/>
         </w:rPr>
-        <w:t xml:space="preserve">A.5 What is not provable here (honest statement)</w:t>
+        <w:t xml:space="preserve">A.5 Scope of the formal results</w:t>
       </w:r>
     </w:p>
     <w:p>
@@ -22969,7 +22948,7 @@
           <w:spacing w:val="0"/>
           <w:color w:val="0E0E0E"/>
         </w:rPr>
-        <w:t xml:space="preserve"> of the minimal observation set is an empirical statement over the target workload family (the 14-round showdown plus the C5 intervention), not a theorem; its direct checks (aligned-phase customer evidence, anti-aliasing sampling comparison) are reported where available, with the anti-aliasing experiment listed as future work.</w:t>
+        <w:t xml:space="preserve"> of the minimal observation set is an empirical statement over the target workload family (the 14-round comparison plus the C5 intervention), not a theorem; its direct checks (aligned-phase customer evidence, anti-aliasing sampling comparison) are reported where available, with the anti-aliasing experiment listed as future work.</w:t>
       </w:r>
     </w:p>
     <w:p>

</xml_diff>

<commit_message>
paper update 2026-10-14 13:57
</commit_message>
<xml_diff>
--- a/artifacts/submission/JNSM_manuscript.docx
+++ b/artifacts/submission/JNSM_manuscript.docx
@@ -124,7 +124,7 @@
           <w:spacing w:val="0"/>
           <w:color w:val="0E0E0E"/>
         </w:rPr>
-        <w:t xml:space="preserve">oversubscription; admission control; censored demand; phase structure; tail latency; observation design; cloud resource management</w:t>
+        <w:t xml:space="preserve">oversubscription; admission control; censored demand; phase structure; tail latency; cloud resource management</w:t>
       </w:r>
     </w:p>
     <w:p>
@@ -7064,7 +7064,7 @@
           <w:spacing w:val="0"/>
           <w:color w:val="262626"/>
         </w:rPr>
-        <w:t xml:space="preserve">Figure 5 Censoring: usage panel vs true demand</w:t>
+        <w:t xml:space="preserve">Figure 5 Censoring: usage panel vs true demand (both panels n=7 cycles)</w:t>
       </w:r>
     </w:p>
     <w:p>
@@ -7981,7 +7981,7 @@
           <w:spacing w:val="0"/>
           <w:color w:val="262626"/>
         </w:rPr>
-        <w:t xml:space="preserve">Figure 6 CPU quota vs the safe knee</w:t>
+        <w:t xml:space="preserve">Figure 6 CPU quota vs the safe knee (isolated arm tested to 5 neighbors, others 4 - a different-load-intensity comparison)</w:t>
       </w:r>
     </w:p>
     <w:p>
@@ -9540,17 +9540,38 @@
           <w:spacing w:val="0"/>
           <w:color w:val="0E0E0E"/>
         </w:rPr>
-        <w:t xml:space="preserve">quota consumption cap</w:t>
-      </w:r>
-      <w:r>
-        <w:rPr>
-          <w:rFonts w:ascii="Times New Roman" w:hAnsi="Times New Roman" w:cs="Times New Roman"/>
-          <w:sz w:val="30"/>
-          <w:sz-cs w:val="30"/>
-          <w:spacing w:val="0"/>
-          <w:color w:val="0E0E0E"/>
-        </w:rPr>
-        <w:t xml:space="preserve"> (under </w:t>
+        <w:t xml:space="preserve">measured one-second peak prior</w:t>
+      </w:r>
+      <w:r>
+        <w:rPr>
+          <w:rFonts w:ascii="Times New Roman" w:hAnsi="Times New Roman" w:cs="Times New Roman"/>
+          <w:sz w:val="30"/>
+          <w:sz-cs w:val="30"/>
+          <w:spacing w:val="0"/>
+          <w:color w:val="0E0E0E"/>
+        </w:rPr>
+        <w:t xml:space="preserve"> (the quota is only a </w:t>
+      </w:r>
+      <w:r>
+        <w:rPr>
+          <w:rFonts w:ascii="Times New Roman" w:hAnsi="Times New Roman" w:cs="Times New Roman"/>
+          <w:sz w:val="30"/>
+          <w:sz-cs w:val="30"/>
+          <w:i/>
+          <w:spacing w:val="0"/>
+          <w:color w:val="0E0E0E"/>
+        </w:rPr>
+        <w:t xml:space="preserve">period-average</w:t>
+      </w:r>
+      <w:r>
+        <w:rPr>
+          <w:rFonts w:ascii="Times New Roman" w:hAnsi="Times New Roman" w:cs="Times New Roman"/>
+          <w:sz w:val="30"/>
+          <w:sz-cs w:val="30"/>
+          <w:spacing w:val="0"/>
+          <w:color w:val="0E0E0E"/>
+        </w:rPr>
+        <w:t xml:space="preserve"> bound: </w:t>
       </w:r>
       <w:r>
         <w:rPr>
@@ -9570,7 +9591,7 @@
           <w:spacing w:val="0"/>
           <w:color w:val="0E0E0E"/>
         </w:rPr>
-        <w:t xml:space="preserve">, a tenant's maximum instantaneous consumption is its quota, not its uncensored demand). Admit only if reserve + candidate caps ≤ effective tenant-core capacity (× utilization budget). Batch arrivals first reserve capacity; the same spare must not be promised twice.</w:t>
+        <w:t xml:space="preserve"> limits the CPU-time budget per quota period, not the instantaneous rate — a throttled tenant can still reach a full vCPU until its period budget exhausts). Admit only if reserve + candidate caps ≤ effective tenant-core capacity (× utilization budget). Batch arrivals first reserve capacity; the same spare must not be promised twice.</w:t>
       </w:r>
     </w:p>
     <w:p>
@@ -18270,7 +18291,7 @@
           <w:spacing w:val="0"/>
           <w:color w:val="262626"/>
         </w:rPr>
-        <w:t xml:space="preserve">Figure 30 Capacity-risk curves (workload side): policy stops on the eps=0 edge</w:t>
+        <w:t xml:space="preserve">Figure 30 Capacity-risk curves (workload side; empirical risk: per-round violation frequency, n = rounds per level)</w:t>
       </w:r>
     </w:p>
     <w:p>
@@ -22260,7 +22281,7 @@
           <w:spacing w:val="0"/>
           <w:color w:val="0E0E0E"/>
         </w:rPr>
-        <w:t xml:space="preserve"> Quota censoring makes demand unobservable in aggregate counters: the point estimate equals the running-stretch mean (exact iff the two stretch means agree; constant demand is sufficient but not necessary), the floor q(1+t) is conditional (and, since the reviewer counterexample, explicitly an empirical conservative heuristic rather than a certified bound), and aggregate non-identifiability is constructed. Validation across 90 cycles (30 independent rounds, clustered) shows throttle-corrected estimates match the truth while naive release decisions violate in 90/90; the mixed-occupancy ablation quantifies all five estimators (naive -2.31, quota-scaling +0.01 by coincidence, throttle correction -0.20, full-vCPU +2.70, uncapped -0.16) and isolates the window-dilution effect that multi-resolution throttle sequences will fix.</w:t>
+        <w:t xml:space="preserve"> Quota censoring makes demand unobservable in aggregate counters: the point estimate equals the running-stretch mean (exact iff the two stretch means agree; constant demand is sufficient but not necessary), the floor q(1+t) is conditional (and, following the counterexample above, explicitly an empirical conservative heuristic rather than a certified bound), and aggregate non-identifiability is constructed. Validation across 90 cycles (30 independent rounds, clustered) shows throttle-corrected estimates match the truth while naive release decisions violate in 90/90; the mixed-occupancy ablation quantifies all five estimators (naive -2.31, quota-scaling +0.01 by coincidence, throttle correction -0.20, full-vCPU +2.70, uncapped -0.16) and isolates the window-dilution effect that multi-resolution throttle sequences will fix.</w:t>
       </w:r>
     </w:p>
     <w:p>
@@ -22352,7 +22373,7 @@
           <w:spacing w:val="0"/>
           <w:color w:val="0E0E0E"/>
         </w:rPr>
-        <w:t xml:space="preserve">Honest boundaries.</w:t>
+        <w:t xml:space="preserve">Limitations.</w:t>
       </w:r>
       <w:r>
         <w:rPr>

</xml_diff>

<commit_message>
paper update 2026-10-14 14:00
</commit_message>
<xml_diff>
--- a/artifacts/submission/JNSM_manuscript.docx
+++ b/artifacts/submission/JNSM_manuscript.docx
@@ -16215,7 +16215,7 @@
           <w:spacing w:val="0"/>
           <w:color w:val="0E0E0E"/>
         </w:rPr>
-        <w:t xml:space="preserve"> the 3-h dense excerpt is a night-time quiet segment (busy 30.1%), while the 39-h light window covers day and night (busy 37.7%, peak 66.1%) - the "mostly idle" portrait is a per-VM statement; host-level load follows a day/night rhythm, and capacity-model anchors taken from the quiet segment are labeled as such (the controlled experiments here align with that segment; day/night peak regimes are future work).</w:t>
+        <w:t xml:space="preserve"> the 3-h dense excerpt is a night-time quiet segment (busy 30.1%), while the 42-h light window covers day and night (busy 37.3%, peak 66.1%) - the "mostly idle" portrait is a per-VM statement; host-level load follows a day/night rhythm, and capacity-model anchors taken from the quiet segment are labeled as such (the controlled experiments here align with that segment; day/night peak regimes are future work).</w:t>
       </w:r>
     </w:p>
     <w:p>
@@ -16274,38 +16274,38 @@
           <w:spacing w:val="0"/>
           <w:color w:val="0E0E0E"/>
         </w:rPr>
-        <w:t xml:space="preserve">39 hours of day/night coverage</w:t>
-      </w:r>
-      <w:r>
-        <w:rPr>
-          <w:rFonts w:ascii="Times New Roman" w:hAnsi="Times New Roman" w:cs="Times New Roman"/>
-          <w:sz w:val="30"/>
-          <w:sz-cs w:val="30"/>
-          <w:spacing w:val="0"/>
-          <w:color w:val="0E0E0E"/>
-        </w:rPr>
-        <w:t xml:space="preserve"> (274 points at 5-minute intervals; ~40% of samples missing to relay jitter): host busy mean </w:t>
-      </w:r>
-      <w:r>
-        <w:rPr>
-          <w:rFonts w:ascii="Times New Roman" w:hAnsi="Times New Roman" w:cs="Times New Roman"/>
-          <w:sz w:val="30"/>
-          <w:sz-cs w:val="30"/>
-          <w:b/>
-          <w:spacing w:val="0"/>
-          <w:color w:val="0E0E0E"/>
-        </w:rPr>
-        <w:t xml:space="preserve">37.7%</w:t>
-      </w:r>
-      <w:r>
-        <w:rPr>
-          <w:rFonts w:ascii="Times New Roman" w:hAnsi="Times New Roman" w:cs="Times New Roman"/>
-          <w:sz w:val="30"/>
-          <w:sz-cs w:val="30"/>
-          <w:spacing w:val="0"/>
-          <w:color w:val="0E0E0E"/>
-        </w:rPr>
-        <w:t xml:space="preserve">, P95 55.5%, peak </w:t>
+        <w:t xml:space="preserve">42 hours of day/night coverage</w:t>
+      </w:r>
+      <w:r>
+        <w:rPr>
+          <w:rFonts w:ascii="Times New Roman" w:hAnsi="Times New Roman" w:cs="Times New Roman"/>
+          <w:sz w:val="30"/>
+          <w:sz-cs w:val="30"/>
+          <w:spacing w:val="0"/>
+          <w:color w:val="0E0E0E"/>
+        </w:rPr>
+        <w:t xml:space="preserve"> (as of 2026-10-14; 305 points at 5-minute intervals, ~39% of samples missing to relay jitter): host busy mean </w:t>
+      </w:r>
+      <w:r>
+        <w:rPr>
+          <w:rFonts w:ascii="Times New Roman" w:hAnsi="Times New Roman" w:cs="Times New Roman"/>
+          <w:sz w:val="30"/>
+          <w:sz-cs w:val="30"/>
+          <w:b/>
+          <w:spacing w:val="0"/>
+          <w:color w:val="0E0E0E"/>
+        </w:rPr>
+        <w:t xml:space="preserve">37.3%</w:t>
+      </w:r>
+      <w:r>
+        <w:rPr>
+          <w:rFonts w:ascii="Times New Roman" w:hAnsi="Times New Roman" w:cs="Times New Roman"/>
+          <w:sz w:val="30"/>
+          <w:sz-cs w:val="30"/>
+          <w:spacing w:val="0"/>
+          <w:color w:val="0E0E0E"/>
+        </w:rPr>
+        <w:t xml:space="preserve">, P95 55.3%, peak </w:t>
       </w:r>
       <w:r>
         <w:rPr>
@@ -16337,17 +16337,17 @@
           <w:spacing w:val="0"/>
           <w:color w:val="0E0E0E"/>
         </w:rPr>
-        <w:t xml:space="preserve">87.8 GB</w:t>
-      </w:r>
-      <w:r>
-        <w:rPr>
-          <w:rFonts w:ascii="Times New Roman" w:hAnsi="Times New Roman" w:cs="Times New Roman"/>
-          <w:sz w:val="30"/>
-          <w:sz-cs w:val="30"/>
-          <w:spacing w:val="0"/>
-          <w:color w:val="0E0E0E"/>
-        </w:rPr>
-        <w:t xml:space="preserve">; CPU PSI avg300 mean 5.3, peak 14.0; no reboot in the window. The two-state anchor holds: the quiet/night dense segment (to which the controlled testbed experiments align) and the full day/night light segment together bracket the real load range. 1-minute granularity cannot resolve sub-minute synchrony.</w:t>
+        <w:t xml:space="preserve">63.7 GB</w:t>
+      </w:r>
+      <w:r>
+        <w:rPr>
+          <w:rFonts w:ascii="Times New Roman" w:hAnsi="Times New Roman" w:cs="Times New Roman"/>
+          <w:sz w:val="30"/>
+          <w:sz-cs w:val="30"/>
+          <w:spacing w:val="0"/>
+          <w:color w:val="0E0E0E"/>
+        </w:rPr>
+        <w:t xml:space="preserve">; CPU PSI avg300 mean 5.2, peak 14.0; no reboot in the window. The two-state anchor holds: the quiet/night dense segment (to which the controlled testbed experiments align) and the full day/night light segment together bracket the real load range. 1-minute granularity cannot resolve sub-minute synchrony.</w:t>
       </w:r>
     </w:p>
     <w:p>
@@ -16387,7 +16387,7 @@
           <w:spacing w:val="0"/>
           <w:color w:val="262626"/>
         </w:rPr>
-        <w:t xml:space="preserve">Figure 31 Production two-state anchor: 39-h light window vs the 3-h night excerpt</w:t>
+        <w:t xml:space="preserve">Figure 31 Production two-state anchor: 42-h light window vs the 3-h night excerpt</w:t>
       </w:r>
     </w:p>
     <w:p>
@@ -22383,7 +22383,7 @@
           <w:spacing w:val="0"/>
           <w:color w:val="0E0E0E"/>
         </w:rPr>
-        <w:t xml:space="preserve"> Two testbeds, one bare-metal host; synthetic duty-cycle loads dominate until the production-schedule replay completes; round-level intervals, boundary fine scans, show4/show5 repeats and Phase C modules are labeled in progress rather than concluded; "jointly sufficient" remains an empirical statement until the anti-aliasing runs and show5 land. We hope this provides small VPS providers with a reproducible "observation design + capacity model + controller" starting point, and adds "identifiability boundaries and phase structure" to the oversubscription research agenda.</w:t>
+        <w:t xml:space="preserve"> Two testbeds, one bare-metal host; synthetic duty-cycle loads dominate, with the production-schedule replay (30-minute real schedule plus five-window forward validation) as a scenario anchor; real mixed application workloads and more arrival-order repeats remain future work; round-level ranges are reported throughout, and the formal bootstrap intervals will be refreshed on the frozen data set. "Jointly sufficient" remains an empirical statement for our target workload family. We hope this provides small VPS providers with a reproducible "observation design + capacity model + controller" starting point, and adds "identifiability boundaries and phase structure" to the oversubscription research agenda.</w:t>
       </w:r>
     </w:p>
     <w:p>

</xml_diff>